<commit_message>
conformance: OnlyOffice is the truth (x2t in-container capture), fix PyMuPDF flag bugs, pin corpus docDefaults; rescope to ODF+OOXML cloud tool
- capture-truth.py: bold/serif/mono flag bits were wrong (every serif font was
  'bold'); style score no longer double-counts font substitution
- new capture-oo: run OnlyOffice's own x2t inside the DS container (no host
  networking), same PDF->IR projection as the LO truth
- compare/regression default to .onlyoffice.json; baseline.json rewritten
- corpus: add styles.xml docDefaults so default font/size are well-defined
- scope.yaml: OO GUI is the visual oracle; ODF+OOXML only; vsdx out of scope

Co-Authored-By: Claude Sonnet 5.5 <noreply@anthropic.com>
</commit_message>
<xml_diff>
--- a/conformance/corpus/cases/01-single-paragraph.docx
+++ b/conformance/corpus/cases/01-single-paragraph.docx
@@ -13,4 +13,26 @@
     </w:sectPr>
   </w:body>
 </w:document>
+</file>
+
+<file path=word/styles.xml><?xml version="1.0" encoding="utf-8"?>
+<w:styles xmlns:w="http://schemas.openxmlformats.org/wordprocessingml/2006/main">
+  <w:docDefaults>
+    <w:rPrDefault>
+      <w:rPr>
+        <w:rFonts w:ascii="Liberation Serif" w:hAnsi="Liberation Serif" w:cs="Liberation Serif"/>
+        <w:sz w:val="24"/>
+        <w:szCs w:val="24"/>
+      </w:rPr>
+    </w:rPrDefault>
+    <w:pPrDefault>
+      <w:pPr>
+        <w:spacing w:after="0" w:line="240" w:lineRule="auto"/>
+      </w:pPr>
+    </w:pPrDefault>
+  </w:docDefaults>
+  <w:style w:type="paragraph" w:default="1" w:styleId="Normal">
+    <w:name w:val="Normal"/>
+  </w:style>
+</w:styles>
 </file>
</xml_diff>